<commit_message>
Thêm DB diagram và script SQL từ dbdiagram.io, cập nhật README
</commit_message>
<xml_diff>
--- a/Docs/HRM_Salary_Grade_Promotion_Wireframe_UIUX_EN.docx
+++ b/Docs/HRM_Salary_Grade_Promotion_Wireframe_UIUX_EN.docx
@@ -20,10 +20,13 @@
         <w:pStyle w:val="Heading1"/>
       </w:pPr>
       <w:r>
+        <w:t xml:space="preserve">1. Screen </w:t>
+      </w:r>
+      <w:r>
         <w:t>1</w:t>
       </w:r>
       <w:r>
-        <w:t>. Screen 2 - Review Period List</w:t>
+        <w:t xml:space="preserve"> - Review Period List</w:t>
       </w:r>
     </w:p>
     <w:p>
@@ -138,10 +141,13 @@
       </w:pPr>
       <w:r>
         <w:lastRenderedPageBreak/>
+        <w:t xml:space="preserve">2. Screen </w:t>
+      </w:r>
+      <w:r>
         <w:t>2</w:t>
       </w:r>
       <w:r>
-        <w:t>. Screen 3 - Review Period Details</w:t>
+        <w:t xml:space="preserve"> - Review Period Details</w:t>
       </w:r>
     </w:p>
     <w:p>
@@ -264,10 +270,13 @@
       </w:pPr>
       <w:r>
         <w:lastRenderedPageBreak/>
+        <w:t xml:space="preserve">3. Screen </w:t>
+      </w:r>
+      <w:r>
         <w:t>3</w:t>
       </w:r>
       <w:r>
-        <w:t>. Screen 4 - Employee Review Details</w:t>
+        <w:t xml:space="preserve"> - Employee Review Details</w:t>
       </w:r>
     </w:p>
     <w:p>
@@ -390,10 +399,13 @@
       </w:pPr>
       <w:r>
         <w:lastRenderedPageBreak/>
+        <w:t xml:space="preserve">4. Screen </w:t>
+      </w:r>
+      <w:r>
         <w:t>4</w:t>
       </w:r>
       <w:r>
-        <w:t>. Screen 5 - Create/Issue Salary Decision</w:t>
+        <w:t xml:space="preserve"> - Create/Issue Salary Decision</w:t>
       </w:r>
     </w:p>
     <w:p>
@@ -516,10 +528,13 @@
       </w:pPr>
       <w:r>
         <w:lastRenderedPageBreak/>
+        <w:t xml:space="preserve">5. Screen </w:t>
+      </w:r>
+      <w:r>
         <w:t>5</w:t>
       </w:r>
       <w:r>
-        <w:t>. Screen 6 - Employee Salary History</w:t>
+        <w:t xml:space="preserve"> - Employee Salary History</w:t>
       </w:r>
     </w:p>
     <w:p>
@@ -633,10 +648,7 @@
         <w:pStyle w:val="Heading1"/>
       </w:pPr>
       <w:r>
-        <w:t>6</w:t>
-      </w:r>
-      <w:r>
-        <w:t>. Recommended Navigation Flow</w:t>
+        <w:t>6. Recommended Navigation Flow</w:t>
       </w:r>
     </w:p>
     <w:p>
@@ -649,10 +661,7 @@
         <w:pStyle w:val="Heading1"/>
       </w:pPr>
       <w:r>
-        <w:t>7</w:t>
-      </w:r>
-      <w:r>
-        <w:t>. Common UX Rules</w:t>
+        <w:t>7. Common UX Rules</w:t>
       </w:r>
     </w:p>
     <w:p>
@@ -725,10 +734,7 @@
         <w:pStyle w:val="Heading1"/>
       </w:pPr>
       <w:r>
-        <w:t>8</w:t>
-      </w:r>
-      <w:r>
-        <w:t>. Mapping the 8 Database Tables to the UI</w:t>
+        <w:t>8. Mapping the 8 Database Tables to the UI</w:t>
       </w:r>
     </w:p>
     <w:tbl>
@@ -1467,11 +1473,6 @@
     <w:lsdException w:name="Book Title" w:uiPriority="33" w:qFormat="1"/>
     <w:lsdException w:name="Bibliography" w:semiHidden="1" w:uiPriority="37" w:unhideWhenUsed="1"/>
     <w:lsdException w:name="TOC Heading" w:semiHidden="1" w:uiPriority="39" w:unhideWhenUsed="1" w:qFormat="1"/>
-    <w:lsdException w:name="Plain Table 5" w:semiHidden="1" w:unhideWhenUsed="1"/>
-    <w:lsdException w:name="Grid Table Light" w:semiHidden="1" w:unhideWhenUsed="1"/>
-    <w:lsdException w:name="Grid Table 1 Light" w:semiHidden="1" w:unhideWhenUsed="1"/>
-    <w:lsdException w:name="Grid Table 2" w:semiHidden="1" w:unhideWhenUsed="1"/>
-    <w:lsdException w:name="Grid Table 3" w:semiHidden="1" w:unhideWhenUsed="1"/>
     <w:lsdException w:name="Grid Table 4" w:uiPriority="49"/>
     <w:lsdException w:name="Grid Table 5 Dark" w:uiPriority="50"/>
     <w:lsdException w:name="Grid Table 6 Colorful" w:uiPriority="51"/>

</xml_diff>

<commit_message>
Chuẩn hóa tài liệu: gộp folder Database, chuyển C4 sang Mermaid, sửa vai trò trong wireframe/Arc42
- Gộp DB_Diagram, dbml, SQL, docx thiết kế CSDL vào Docs/Database/, thêm ERD Mermaid
- Chuyển 4 diagram C4 (Context/Container/Component/Code) từ draw.io sang Mermaid
- Sửa wireframe EN/VI: gán đúng actor cho từng màn hình, tách luồng điều hướng HR Staff/Approver
- Sửa Arc42: đồng bộ vai trò ở Runtime View/System Context, bỏ nội dung ngoài phạm vi (Allowance/Attendance), bổ sung 3 ADR còn thiếu
- Bổ sung User Stories: rule đủ điều kiện nâng bậc cụ thể, cột Depends on/Size theo INVEST
</commit_message>
<xml_diff>
--- a/Docs/HRM_Salary_Grade_Promotion_Wireframe_UIUX_EN.docx
+++ b/Docs/HRM_Salary_Grade_Promotion_Wireframe_UIUX_EN.docx
@@ -20,14 +20,10 @@
         <w:pStyle w:val="Heading1"/>
       </w:pPr>
       <w:r>
-        <w:t xml:space="preserve">1. Screen </w:t>
+        <w:t>1. Screen 1 - Review Period List (HR Staff)</w:t>
       </w:r>
-      <w:r>
-        <w:t>1</w:t>
-      </w:r>
-      <w:r>
-        <w:t xml:space="preserve"> - Review Period List</w:t>
-      </w:r>
+      <w:r/>
+      <w:r/>
     </w:p>
     <w:p>
       <w:pPr>
@@ -140,15 +136,10 @@
         <w:pStyle w:val="Heading1"/>
       </w:pPr>
       <w:r>
-        <w:lastRenderedPageBreak/>
-        <w:t xml:space="preserve">2. Screen </w:t>
+        <w:t>2. Screen 2 - Review Period Details (HR Staff)</w:t>
       </w:r>
-      <w:r>
-        <w:t>2</w:t>
-      </w:r>
-      <w:r>
-        <w:t xml:space="preserve"> - Review Period Details</w:t>
-      </w:r>
+      <w:r/>
+      <w:r/>
     </w:p>
     <w:p>
       <w:pPr>
@@ -269,15 +260,10 @@
         <w:pStyle w:val="Heading1"/>
       </w:pPr>
       <w:r>
-        <w:lastRenderedPageBreak/>
-        <w:t xml:space="preserve">3. Screen </w:t>
+        <w:t>3. Screen 3 - Employee Review Details (HR Staff)</w:t>
       </w:r>
-      <w:r>
-        <w:t>3</w:t>
-      </w:r>
-      <w:r>
-        <w:t xml:space="preserve"> - Employee Review Details</w:t>
-      </w:r>
+      <w:r/>
+      <w:r/>
     </w:p>
     <w:p>
       <w:pPr>
@@ -345,7 +331,7 @@
         <w:pStyle w:val="ListBullet"/>
       </w:pPr>
       <w:r>
-        <w:t>Proposed grades should be limited to the employee's valid salary scale.</w:t>
+        <w:t>The system automatically calculates the proposed grade and coefficient for each eligible employee, limited to their valid salary scale; HR Staff reviews this system-calculated value rather than entering it manually.</w:t>
       </w:r>
     </w:p>
     <w:p>
@@ -377,7 +363,7 @@
         <w:pStyle w:val="ListBullet"/>
       </w:pPr>
       <w:r>
-        <w:t>The adjacent salary history gives the approver enough context without leaving the screen.</w:t>
+        <w:t>The adjacent salary history gives HR Staff enough context without leaving the screen.</w:t>
       </w:r>
     </w:p>
     <w:p>
@@ -398,15 +384,10 @@
         <w:pStyle w:val="Heading1"/>
       </w:pPr>
       <w:r>
-        <w:lastRenderedPageBreak/>
-        <w:t xml:space="preserve">4. Screen </w:t>
+        <w:t>4. Screen 4 - Create/Issue Salary Decision (Approver)</w:t>
       </w:r>
-      <w:r>
-        <w:t>4</w:t>
-      </w:r>
-      <w:r>
-        <w:t xml:space="preserve"> - Create/Issue Salary Decision</w:t>
-      </w:r>
+      <w:r/>
+      <w:r/>
     </w:p>
     <w:p>
       <w:pPr>
@@ -462,6 +443,16 @@
       </w:r>
     </w:p>
     <w:p>
+      <w:r>
+        <w:t>This screen is used by the Approver, after HR Staff has submitted a review period; the Approved Employees list already reflects HR Staff's screening, so no separate review screen is required before drafting the decision.</w:t>
+      </w:r>
+    </w:p>
+    <w:p>
+      <w:r>
+        <w:t>Save Draft corresponds to preparing the decision; Issue Decision corresponds to making it official (see User Stories US-06 and US-07).</w:t>
+      </w:r>
+    </w:p>
+    <w:p>
       <w:pPr>
         <w:pStyle w:val="ListBullet"/>
       </w:pPr>
@@ -527,15 +518,10 @@
         <w:pStyle w:val="Heading1"/>
       </w:pPr>
       <w:r>
-        <w:lastRenderedPageBreak/>
-        <w:t xml:space="preserve">5. Screen </w:t>
+        <w:t>5. Screen 5 - Employee Salary History (HR Staff / Approver)</w:t>
       </w:r>
-      <w:r>
-        <w:t>5</w:t>
-      </w:r>
-      <w:r>
-        <w:t xml:space="preserve"> - Employee Salary History</w:t>
-      </w:r>
+      <w:r/>
+      <w:r/>
     </w:p>
     <w:p>
       <w:pPr>
@@ -653,7 +639,12 @@
     </w:p>
     <w:p>
       <w:r>
-        <w:t>Dashboard → Review Period List → Review Period Details → Employee Details → Submit/approve results → Create Decision → Issue Decision → Update Salary History.</w:t>
+        <w:t>HR Staff flow: Dashboard → Review Period List → Review Period Details → Employee Details → Approve/Reject Employees → Submit Review Period.</w:t>
+      </w:r>
+    </w:p>
+    <w:p>
+      <w:r>
+        <w:t>Approver flow (after the review period is submitted): Review Period Details → Create Decision → Issue Decision → Update Salary History.</w:t>
       </w:r>
     </w:p>
     <w:p>

</xml_diff>